<commit_message>
adjust some menus in each role, fix bugs
</commit_message>
<xml_diff>
--- a/public/documents/contract-template.docx
+++ b/public/documents/contract-template.docx
@@ -228,6 +228,7 @@
                     <w:t xml:space="preserve"> Lt. II Manado, </w:t>
                   </w:r>
                   <w:proofErr w:type="spellStart"/>
+                  <w:proofErr w:type="gramStart"/>
                   <w:r>
                     <w:rPr>
                       <w:rFonts w:ascii="Agency FB" w:hAnsi="Agency FB" w:cs="Calibri"/>
@@ -238,6 +239,7 @@
                     <w:t>Jl.WalandaMaramis</w:t>
                   </w:r>
                   <w:proofErr w:type="spellEnd"/>
+                  <w:proofErr w:type="gramEnd"/>
                   <w:r>
                     <w:rPr>
                       <w:rFonts w:ascii="Agency FB" w:hAnsi="Agency FB" w:cs="Calibri"/>
@@ -248,6 +250,7 @@
                     <w:t xml:space="preserve"> No.123, Kel. </w:t>
                   </w:r>
                   <w:proofErr w:type="spellStart"/>
+                  <w:proofErr w:type="gramStart"/>
                   <w:r>
                     <w:rPr>
                       <w:rFonts w:ascii="Agency FB" w:hAnsi="Agency FB" w:cs="Calibri"/>
@@ -258,6 +261,7 @@
                     <w:t>Pinaesaan,Kec</w:t>
                   </w:r>
                   <w:proofErr w:type="spellEnd"/>
+                  <w:proofErr w:type="gramEnd"/>
                   <w:r>
                     <w:rPr>
                       <w:rFonts w:ascii="Agency FB" w:hAnsi="Agency FB" w:cs="Calibri"/>
@@ -675,6 +679,24 @@
           <w:sz w:val="40"/>
           <w:szCs w:val="40"/>
         </w:rPr>
+        <w:t xml:space="preserve"> Ruangan</w:t>
+      </w:r>
+      <w:r>
+        <w:rPr>
+          <w:rFonts w:ascii="Arabic Typesetting" w:hAnsi="Arabic Typesetting" w:cs="Arabic Typesetting"/>
+          <w:b/>
+          <w:sz w:val="40"/>
+          <w:szCs w:val="40"/>
+        </w:rPr>
+        <w:t xml:space="preserve"> No.</w:t>
+      </w:r>
+      <w:r>
+        <w:rPr>
+          <w:rFonts w:ascii="Arabic Typesetting" w:hAnsi="Arabic Typesetting" w:cs="Arabic Typesetting"/>
+          <w:b/>
+          <w:sz w:val="40"/>
+          <w:szCs w:val="40"/>
+        </w:rPr>
         <w:t xml:space="preserve"> {room_number}</w:t>
       </w:r>
       <w:r>
@@ -3282,7 +3304,17 @@
           <w:szCs w:val="24"/>
           <w:lang w:val="en-US"/>
         </w:rPr>
-        <w:t xml:space="preserve"> Pasar</w:t>
+        <w:t xml:space="preserve"> </w:t>
+      </w:r>
+      <w:proofErr w:type="gramStart"/>
+      <w:r>
+        <w:rPr>
+          <w:rFonts w:cs="Arial"/>
+          <w:sz w:val="24"/>
+          <w:szCs w:val="24"/>
+          <w:lang w:val="en-US"/>
+        </w:rPr>
+        <w:t>Pasar</w:t>
       </w:r>
       <w:r>
         <w:rPr>
@@ -3325,6 +3357,7 @@
         </w:rPr>
         <w:t>-----</w:t>
       </w:r>
+      <w:proofErr w:type="gramEnd"/>
     </w:p>
     <w:p>
       <w:pPr>
@@ -3615,6 +3648,48 @@
           <w:szCs w:val="24"/>
         </w:rPr>
         <w:t xml:space="preserve"> Ruangan/kios</w:t>
+      </w:r>
+      <w:r>
+        <w:rPr>
+          <w:rFonts w:cs="Arial"/>
+          <w:sz w:val="24"/>
+          <w:szCs w:val="24"/>
+          <w:lang w:val="en-US"/>
+        </w:rPr>
+        <w:t xml:space="preserve"> </w:t>
+      </w:r>
+      <w:proofErr w:type="spellStart"/>
+      <w:r>
+        <w:rPr>
+          <w:rFonts w:cs="Arial"/>
+          <w:b/>
+          <w:bCs/>
+          <w:sz w:val="24"/>
+          <w:szCs w:val="24"/>
+          <w:lang w:val="en-US"/>
+        </w:rPr>
+        <w:t>Ruangan</w:t>
+      </w:r>
+      <w:proofErr w:type="spellEnd"/>
+      <w:r>
+        <w:rPr>
+          <w:rFonts w:cs="Arial"/>
+          <w:sz w:val="24"/>
+          <w:szCs w:val="24"/>
+          <w:lang w:val="en-US"/>
+        </w:rPr>
+        <w:t xml:space="preserve"> </w:t>
+      </w:r>
+      <w:r>
+        <w:rPr>
+          <w:rFonts w:cs="Arial"/>
+          <w:b/>
+          <w:bCs/>
+          <w:sz w:val="24"/>
+          <w:szCs w:val="24"/>
+          <w:lang w:val="en-US"/>
+        </w:rPr>
+        <w:t>No.</w:t>
       </w:r>
       <w:r>
         <w:rPr>
@@ -6958,6 +7033,34 @@
           <w:szCs w:val="24"/>
         </w:rPr>
         <w:t xml:space="preserve">Pihak pertama selaku pengelolah bangunan Ruangan/Kios </w:t>
+      </w:r>
+      <w:r>
+        <w:rPr>
+          <w:rFonts w:cs="Arial"/>
+          <w:b/>
+          <w:bCs/>
+          <w:sz w:val="24"/>
+          <w:szCs w:val="24"/>
+        </w:rPr>
+        <w:t>Ruangan</w:t>
+      </w:r>
+      <w:r>
+        <w:rPr>
+          <w:rFonts w:cs="Arial"/>
+          <w:b/>
+          <w:bCs/>
+          <w:sz w:val="24"/>
+          <w:szCs w:val="24"/>
+        </w:rPr>
+        <w:t xml:space="preserve"> No.</w:t>
+      </w:r>
+      <w:r>
+        <w:rPr>
+          <w:rFonts w:cs="Arial"/>
+          <w:sz w:val="24"/>
+          <w:szCs w:val="24"/>
+        </w:rPr>
+        <w:t xml:space="preserve"> </w:t>
       </w:r>
       <w:r>
         <w:rPr>
@@ -7813,6 +7916,7 @@
         <w:t xml:space="preserve"> dan </w:t>
       </w:r>
       <w:proofErr w:type="spellStart"/>
+      <w:proofErr w:type="gramStart"/>
       <w:r>
         <w:rPr>
           <w:rFonts w:cs="Arial"/>
@@ -7843,6 +7947,7 @@
         <w:t>terkait</w:t>
       </w:r>
       <w:proofErr w:type="spellEnd"/>
+      <w:proofErr w:type="gramEnd"/>
       <w:r>
         <w:rPr>
           <w:rFonts w:cs="Arial"/>
@@ -8600,7 +8705,17 @@
           <w:szCs w:val="24"/>
           <w:lang w:val="en-US"/>
         </w:rPr>
-        <w:t xml:space="preserve"> Gedung Pertokoan</w:t>
+        <w:t xml:space="preserve"> Gedung </w:t>
+      </w:r>
+      <w:proofErr w:type="gramStart"/>
+      <w:r>
+        <w:rPr>
+          <w:rFonts w:cs="Arial"/>
+          <w:sz w:val="24"/>
+          <w:szCs w:val="24"/>
+          <w:lang w:val="en-US"/>
+        </w:rPr>
+        <w:t>Pertokoan</w:t>
       </w:r>
       <w:r>
         <w:rPr>
@@ -8611,6 +8726,7 @@
         </w:rPr>
         <w:t>.----------------------------------------------------------------------------------------------------------</w:t>
       </w:r>
+      <w:proofErr w:type="gramEnd"/>
     </w:p>
     <w:p>
       <w:pPr>
@@ -9964,7 +10080,17 @@
           <w:szCs w:val="24"/>
           <w:lang w:val="en-US"/>
         </w:rPr>
-        <w:t xml:space="preserve"> di Indonesia</w:t>
+        <w:t xml:space="preserve"> di </w:t>
+      </w:r>
+      <w:proofErr w:type="gramStart"/>
+      <w:r>
+        <w:rPr>
+          <w:rFonts w:cs="Arial"/>
+          <w:sz w:val="24"/>
+          <w:szCs w:val="24"/>
+          <w:lang w:val="en-US"/>
+        </w:rPr>
+        <w:t>Indonesia</w:t>
       </w:r>
       <w:r>
         <w:rPr>
@@ -9993,6 +10119,7 @@
         </w:rPr>
         <w:t>----------------------</w:t>
       </w:r>
+      <w:proofErr w:type="gramEnd"/>
     </w:p>
     <w:p>
       <w:pPr>
@@ -11302,6 +11429,7 @@
                 <w:lang w:val="en-US"/>
               </w:rPr>
             </w:pPr>
+            <w:proofErr w:type="gramStart"/>
             <w:r>
               <w:rPr>
                 <w:rFonts w:eastAsia="Times New Roman" w:cs="Arial"/>
@@ -11310,8 +11438,31 @@
                 <w:szCs w:val="28"/>
                 <w:lang w:val="en-US"/>
               </w:rPr>
-              <w:t>LUCKY  A.  SENDUK, S.Ked</w:t>
+              <w:t>LUCKY  A.</w:t>
             </w:r>
+            <w:proofErr w:type="gramEnd"/>
+            <w:r>
+              <w:rPr>
+                <w:rFonts w:eastAsia="Times New Roman" w:cs="Arial"/>
+                <w:b/>
+                <w:sz w:val="28"/>
+                <w:szCs w:val="28"/>
+                <w:lang w:val="en-US"/>
+              </w:rPr>
+              <w:t xml:space="preserve">  SENDUK, </w:t>
+            </w:r>
+            <w:proofErr w:type="gramStart"/>
+            <w:r>
+              <w:rPr>
+                <w:rFonts w:eastAsia="Times New Roman" w:cs="Arial"/>
+                <w:b/>
+                <w:sz w:val="28"/>
+                <w:szCs w:val="28"/>
+                <w:lang w:val="en-US"/>
+              </w:rPr>
+              <w:t>S.Ked</w:t>
+            </w:r>
+            <w:proofErr w:type="gramEnd"/>
           </w:p>
         </w:tc>
       </w:tr>

</xml_diff>

<commit_message>
fixed bugs in room calculations and total payments, and improved document styling
</commit_message>
<xml_diff>
--- a/public/documents/contract-template.docx
+++ b/public/documents/contract-template.docx
@@ -228,7 +228,6 @@
                     <w:t xml:space="preserve"> Lt. II Manado, </w:t>
                   </w:r>
                   <w:proofErr w:type="spellStart"/>
-                  <w:proofErr w:type="gramStart"/>
                   <w:r>
                     <w:rPr>
                       <w:rFonts w:ascii="Agency FB" w:hAnsi="Agency FB" w:cs="Calibri"/>
@@ -239,7 +238,6 @@
                     <w:t>Jl.WalandaMaramis</w:t>
                   </w:r>
                   <w:proofErr w:type="spellEnd"/>
-                  <w:proofErr w:type="gramEnd"/>
                   <w:r>
                     <w:rPr>
                       <w:rFonts w:ascii="Agency FB" w:hAnsi="Agency FB" w:cs="Calibri"/>
@@ -250,7 +248,6 @@
                     <w:t xml:space="preserve"> No.123, Kel. </w:t>
                   </w:r>
                   <w:proofErr w:type="spellStart"/>
-                  <w:proofErr w:type="gramStart"/>
                   <w:r>
                     <w:rPr>
                       <w:rFonts w:ascii="Agency FB" w:hAnsi="Agency FB" w:cs="Calibri"/>
@@ -261,7 +258,6 @@
                     <w:t>Pinaesaan,Kec</w:t>
                   </w:r>
                   <w:proofErr w:type="spellEnd"/>
-                  <w:proofErr w:type="gramEnd"/>
                   <w:r>
                     <w:rPr>
                       <w:rFonts w:ascii="Agency FB" w:hAnsi="Agency FB" w:cs="Calibri"/>
@@ -3304,17 +3300,7 @@
           <w:szCs w:val="24"/>
           <w:lang w:val="en-US"/>
         </w:rPr>
-        <w:t xml:space="preserve"> </w:t>
-      </w:r>
-      <w:proofErr w:type="gramStart"/>
-      <w:r>
-        <w:rPr>
-          <w:rFonts w:cs="Arial"/>
-          <w:sz w:val="24"/>
-          <w:szCs w:val="24"/>
-          <w:lang w:val="en-US"/>
-        </w:rPr>
-        <w:t>Pasar</w:t>
+        <w:t xml:space="preserve"> Pasar</w:t>
       </w:r>
       <w:r>
         <w:rPr>
@@ -3357,7 +3343,6 @@
         </w:rPr>
         <w:t>-----</w:t>
       </w:r>
-      <w:proofErr w:type="gramEnd"/>
     </w:p>
     <w:p>
       <w:pPr>
@@ -5741,7 +5726,7 @@
           <w:sz w:val="24"/>
           <w:szCs w:val="24"/>
         </w:rPr>
-        <w:t>dan iuran jasa Administrasi sebesar Rp. 50.000; (</w:t>
+        <w:t>dan iuran jasa Administrasi sebesar</w:t>
       </w:r>
       <w:r>
         <w:rPr>
@@ -5751,8 +5736,9 @@
           <w:sz w:val="24"/>
           <w:szCs w:val="24"/>
         </w:rPr>
-        <w:t>L</w:t>
-      </w:r>
+        <w:t xml:space="preserve"> {</w:t>
+      </w:r>
+      <w:proofErr w:type="spellStart"/>
       <w:r>
         <w:rPr>
           <w:rFonts w:cs="Arial"/>
@@ -5760,9 +5746,11 @@
           <w:i/>
           <w:sz w:val="24"/>
           <w:szCs w:val="24"/>
-        </w:rPr>
-        <w:t xml:space="preserve">ima </w:t>
-      </w:r>
+          <w:lang w:val="en-ID"/>
+        </w:rPr>
+        <w:t>biayaAdministrasi</w:t>
+      </w:r>
+      <w:proofErr w:type="spellEnd"/>
       <w:r>
         <w:rPr>
           <w:rFonts w:cs="Arial"/>
@@ -5771,7 +5759,7 @@
           <w:sz w:val="24"/>
           <w:szCs w:val="24"/>
         </w:rPr>
-        <w:t>P</w:t>
+        <w:t>}</w:t>
       </w:r>
       <w:r>
         <w:rPr>
@@ -5781,7 +5769,7 @@
           <w:sz w:val="24"/>
           <w:szCs w:val="24"/>
         </w:rPr>
-        <w:t xml:space="preserve">uluh </w:t>
+        <w:t>; (</w:t>
       </w:r>
       <w:r>
         <w:rPr>
@@ -5791,8 +5779,9 @@
           <w:sz w:val="24"/>
           <w:szCs w:val="24"/>
         </w:rPr>
-        <w:t>R</w:t>
-      </w:r>
+        <w:t>{</w:t>
+      </w:r>
+      <w:proofErr w:type="spellStart"/>
       <w:r>
         <w:rPr>
           <w:rFonts w:cs="Arial"/>
@@ -5800,9 +5789,11 @@
           <w:i/>
           <w:sz w:val="24"/>
           <w:szCs w:val="24"/>
-        </w:rPr>
-        <w:t xml:space="preserve">ibu </w:t>
-      </w:r>
+          <w:lang w:val="en-ID"/>
+        </w:rPr>
+        <w:t>biayaAdministrasiInWords</w:t>
+      </w:r>
+      <w:proofErr w:type="spellEnd"/>
       <w:r>
         <w:rPr>
           <w:rFonts w:cs="Arial"/>
@@ -5811,17 +5802,7 @@
           <w:sz w:val="24"/>
           <w:szCs w:val="24"/>
         </w:rPr>
-        <w:t>R</w:t>
-      </w:r>
-      <w:r>
-        <w:rPr>
-          <w:rFonts w:cs="Arial"/>
-          <w:b/>
-          <w:i/>
-          <w:sz w:val="24"/>
-          <w:szCs w:val="24"/>
-        </w:rPr>
-        <w:t>upiah</w:t>
+        <w:t>}</w:t>
       </w:r>
       <w:r>
         <w:rPr>
@@ -7916,7 +7897,6 @@
         <w:t xml:space="preserve"> dan </w:t>
       </w:r>
       <w:proofErr w:type="spellStart"/>
-      <w:proofErr w:type="gramStart"/>
       <w:r>
         <w:rPr>
           <w:rFonts w:cs="Arial"/>
@@ -7947,7 +7927,6 @@
         <w:t>terkait</w:t>
       </w:r>
       <w:proofErr w:type="spellEnd"/>
-      <w:proofErr w:type="gramEnd"/>
       <w:r>
         <w:rPr>
           <w:rFonts w:cs="Arial"/>
@@ -8705,17 +8684,7 @@
           <w:szCs w:val="24"/>
           <w:lang w:val="en-US"/>
         </w:rPr>
-        <w:t xml:space="preserve"> Gedung </w:t>
-      </w:r>
-      <w:proofErr w:type="gramStart"/>
-      <w:r>
-        <w:rPr>
-          <w:rFonts w:cs="Arial"/>
-          <w:sz w:val="24"/>
-          <w:szCs w:val="24"/>
-          <w:lang w:val="en-US"/>
-        </w:rPr>
-        <w:t>Pertokoan</w:t>
+        <w:t xml:space="preserve"> Gedung Pertokoan</w:t>
       </w:r>
       <w:r>
         <w:rPr>
@@ -8726,7 +8695,6 @@
         </w:rPr>
         <w:t>.----------------------------------------------------------------------------------------------------------</w:t>
       </w:r>
-      <w:proofErr w:type="gramEnd"/>
     </w:p>
     <w:p>
       <w:pPr>
@@ -10080,17 +10048,7 @@
           <w:szCs w:val="24"/>
           <w:lang w:val="en-US"/>
         </w:rPr>
-        <w:t xml:space="preserve"> di </w:t>
-      </w:r>
-      <w:proofErr w:type="gramStart"/>
-      <w:r>
-        <w:rPr>
-          <w:rFonts w:cs="Arial"/>
-          <w:sz w:val="24"/>
-          <w:szCs w:val="24"/>
-          <w:lang w:val="en-US"/>
-        </w:rPr>
-        <w:t>Indonesia</w:t>
+        <w:t xml:space="preserve"> di Indonesia</w:t>
       </w:r>
       <w:r>
         <w:rPr>
@@ -10119,7 +10077,6 @@
         </w:rPr>
         <w:t>----------------------</w:t>
       </w:r>
-      <w:proofErr w:type="gramEnd"/>
     </w:p>
     <w:p>
       <w:pPr>
@@ -11429,7 +11386,6 @@
                 <w:lang w:val="en-US"/>
               </w:rPr>
             </w:pPr>
-            <w:proofErr w:type="gramStart"/>
             <w:r>
               <w:rPr>
                 <w:rFonts w:eastAsia="Times New Roman" w:cs="Arial"/>
@@ -11438,31 +11394,8 @@
                 <w:szCs w:val="28"/>
                 <w:lang w:val="en-US"/>
               </w:rPr>
-              <w:t>LUCKY  A.</w:t>
+              <w:t>LUCKY  A.  SENDUK, S.Ked</w:t>
             </w:r>
-            <w:proofErr w:type="gramEnd"/>
-            <w:r>
-              <w:rPr>
-                <w:rFonts w:eastAsia="Times New Roman" w:cs="Arial"/>
-                <w:b/>
-                <w:sz w:val="28"/>
-                <w:szCs w:val="28"/>
-                <w:lang w:val="en-US"/>
-              </w:rPr>
-              <w:t xml:space="preserve">  SENDUK, </w:t>
-            </w:r>
-            <w:proofErr w:type="gramStart"/>
-            <w:r>
-              <w:rPr>
-                <w:rFonts w:eastAsia="Times New Roman" w:cs="Arial"/>
-                <w:b/>
-                <w:sz w:val="28"/>
-                <w:szCs w:val="28"/>
-                <w:lang w:val="en-US"/>
-              </w:rPr>
-              <w:t>S.Ked</w:t>
-            </w:r>
-            <w:proofErr w:type="gramEnd"/>
           </w:p>
         </w:tc>
       </w:tr>
@@ -14694,7 +14627,6 @@
   <w:style w:type="character" w:default="1" w:styleId="DefaultParagraphFont">
     <w:name w:val="Default Paragraph Font"/>
     <w:uiPriority w:val="1"/>
-    <w:semiHidden/>
     <w:unhideWhenUsed/>
   </w:style>
   <w:style w:type="table" w:default="1" w:styleId="TableNormal">

</xml_diff>

<commit_message>
fix styling, Update contract number prefix to use the actual final payment completion date for both full-payment and installment contracts.
</commit_message>
<xml_diff>
--- a/public/documents/contract-template.docx
+++ b/public/documents/contract-template.docx
@@ -1044,17 +1044,7 @@
           <w:sz w:val="72"/>
           <w:szCs w:val="72"/>
         </w:rPr>
-        <w:t>202</w:t>
-      </w:r>
-      <w:r>
-        <w:rPr>
-          <w:rFonts w:ascii="Arabic Typesetting" w:hAnsi="Arabic Typesetting" w:cs="Arabic Typesetting"/>
-          <w:b/>
-          <w:sz w:val="72"/>
-          <w:szCs w:val="72"/>
-          <w:lang w:val="en-US"/>
-        </w:rPr>
-        <w:t>5</w:t>
+        <w:t>{thisYear}</w:t>
       </w:r>
     </w:p>
     <w:p>
@@ -1536,52 +1526,7 @@
           <w:szCs w:val="24"/>
           <w:lang w:val="en-US"/>
         </w:rPr>
-        <w:t>-------</w:t>
-      </w:r>
-      <w:r>
-        <w:rPr>
-          <w:rFonts w:cs="Arial"/>
-          <w:sz w:val="24"/>
-          <w:szCs w:val="24"/>
-          <w:lang w:val="en-US"/>
-        </w:rPr>
-        <w:t>---</w:t>
-      </w:r>
-      <w:r>
-        <w:rPr>
-          <w:rFonts w:cs="Arial"/>
-          <w:sz w:val="24"/>
-          <w:szCs w:val="24"/>
-          <w:lang w:val="en-US"/>
-        </w:rPr>
-        <w:t>-</w:t>
-      </w:r>
-      <w:r>
-        <w:rPr>
-          <w:rFonts w:cs="Arial"/>
-          <w:sz w:val="24"/>
-          <w:szCs w:val="24"/>
-          <w:lang w:val="en-US"/>
-        </w:rPr>
-        <w:t>-------------</w:t>
-      </w:r>
-      <w:r>
-        <w:rPr>
-          <w:rFonts w:cs="Arial"/>
-          <w:sz w:val="24"/>
-          <w:szCs w:val="24"/>
-          <w:lang w:val="en-US"/>
-        </w:rPr>
-        <w:t>--------------------------</w:t>
-      </w:r>
-      <w:r>
-        <w:rPr>
-          <w:rFonts w:cs="Arial"/>
-          <w:sz w:val="24"/>
-          <w:szCs w:val="24"/>
-          <w:lang w:val="en-US"/>
-        </w:rPr>
-        <w:t>-------</w:t>
+        <w:t>-----</w:t>
       </w:r>
     </w:p>
     <w:p>
@@ -1723,6 +1668,14 @@
           <w:sz w:val="24"/>
           <w:szCs w:val="24"/>
         </w:rPr>
+        <w:t xml:space="preserve"> </w:t>
+      </w:r>
+      <w:r>
+        <w:rPr>
+          <w:rFonts w:eastAsia="Times New Roman" w:cs="Arial"/>
+          <w:sz w:val="24"/>
+          <w:szCs w:val="24"/>
+        </w:rPr>
         <w:t xml:space="preserve">Kelurahan Titiwungen Utara Kecamatan </w:t>
       </w:r>
       <w:r>
@@ -1965,14 +1918,99 @@
           <w:szCs w:val="24"/>
           <w:lang w:val="en-US"/>
         </w:rPr>
+        <w:t>--------------------------------------------------------</w:t>
+      </w:r>
+      <w:r>
+        <w:rPr>
+          <w:rFonts w:cs="Arial"/>
+          <w:b/>
+          <w:sz w:val="24"/>
+          <w:szCs w:val="24"/>
+        </w:rPr>
+        <w:t>Selanjutnya disebut</w:t>
+      </w:r>
+      <w:r>
+        <w:rPr>
+          <w:rFonts w:cs="Arial"/>
+          <w:sz w:val="24"/>
+          <w:szCs w:val="24"/>
+        </w:rPr>
+        <w:t>:</w:t>
+      </w:r>
+      <w:r>
+        <w:rPr>
+          <w:rFonts w:cs="Arial"/>
+          <w:sz w:val="24"/>
+          <w:szCs w:val="24"/>
+        </w:rPr>
+        <w:t>---------------------------------------------------------------------------------</w:t>
+      </w:r>
+      <w:r>
+        <w:rPr>
+          <w:rFonts w:cs="Arial"/>
+          <w:b/>
+          <w:sz w:val="24"/>
+          <w:szCs w:val="24"/>
+        </w:rPr>
+        <w:t>PIHAK PERTAMA –</w:t>
+      </w:r>
+      <w:r>
+        <w:rPr>
+          <w:rFonts w:cs="Arial"/>
+          <w:b/>
+          <w:sz w:val="24"/>
+          <w:szCs w:val="24"/>
+        </w:rPr>
+        <w:t xml:space="preserve"> Y</w:t>
+      </w:r>
+      <w:r>
+        <w:rPr>
+          <w:rFonts w:cs="Arial"/>
+          <w:b/>
+          <w:sz w:val="24"/>
+          <w:szCs w:val="24"/>
+        </w:rPr>
+        <w:t>ANG MENYEWAKAN</w:t>
+      </w:r>
+      <w:r>
+        <w:rPr>
+          <w:rFonts w:cs="Arial"/>
+          <w:sz w:val="24"/>
+          <w:szCs w:val="24"/>
+        </w:rPr>
+        <w:t>-------</w:t>
+      </w:r>
+      <w:r>
+        <w:rPr>
+          <w:rFonts w:cs="Arial"/>
+          <w:sz w:val="24"/>
+          <w:szCs w:val="24"/>
+          <w:lang w:val="en-US"/>
+        </w:rPr>
+        <w:t>-----</w:t>
+      </w:r>
+      <w:r>
+        <w:rPr>
+          <w:rFonts w:cs="Arial"/>
+          <w:sz w:val="24"/>
+          <w:szCs w:val="24"/>
+          <w:lang w:val="en-US"/>
+        </w:rPr>
+        <w:t>--</w:t>
+      </w:r>
+      <w:r>
+        <w:rPr>
+          <w:rFonts w:cs="Arial"/>
+          <w:sz w:val="24"/>
+          <w:szCs w:val="24"/>
+        </w:rPr>
         <w:t>-</w:t>
       </w:r>
       <w:r>
         <w:rPr>
-          <w:rFonts w:eastAsia="Times New Roman" w:cs="Arial"/>
-          <w:sz w:val="24"/>
-          <w:szCs w:val="24"/>
-          <w:lang w:val="en-US"/>
+          <w:rFonts w:cs="Arial"/>
+          <w:sz w:val="24"/>
+          <w:szCs w:val="24"/>
         </w:rPr>
         <w:t>-</w:t>
       </w:r>
@@ -1982,132 +2020,13 @@
           <w:sz w:val="24"/>
           <w:szCs w:val="24"/>
         </w:rPr>
-        <w:t>-------------------------------------------</w:t>
-      </w:r>
-      <w:r>
-        <w:rPr>
-          <w:rFonts w:cs="Arial"/>
-          <w:sz w:val="24"/>
-          <w:szCs w:val="24"/>
-          <w:lang w:val="en-US"/>
-        </w:rPr>
-        <w:t>-------</w:t>
-      </w:r>
-      <w:r>
-        <w:rPr>
-          <w:rFonts w:cs="Arial"/>
-          <w:sz w:val="24"/>
-          <w:szCs w:val="24"/>
-        </w:rPr>
-        <w:t>----</w:t>
-      </w:r>
-      <w:r>
-        <w:rPr>
-          <w:rFonts w:cs="Arial"/>
-          <w:b/>
-          <w:sz w:val="24"/>
-          <w:szCs w:val="24"/>
-        </w:rPr>
-        <w:t>Selanjutnya disebut</w:t>
-      </w:r>
-      <w:r>
-        <w:rPr>
-          <w:rFonts w:cs="Arial"/>
-          <w:sz w:val="24"/>
-          <w:szCs w:val="24"/>
-        </w:rPr>
-        <w:t xml:space="preserve"> : --------------</w:t>
-      </w:r>
-      <w:r>
-        <w:rPr>
-          <w:rFonts w:cs="Arial"/>
-          <w:sz w:val="24"/>
-          <w:szCs w:val="24"/>
-        </w:rPr>
-        <w:t>------------------------------</w:t>
-      </w:r>
-      <w:r>
-        <w:rPr>
-          <w:rFonts w:cs="Arial"/>
-          <w:sz w:val="24"/>
-          <w:szCs w:val="24"/>
-        </w:rPr>
-        <w:t>-------------------------</w:t>
-      </w:r>
-      <w:r>
-        <w:rPr>
-          <w:rFonts w:cs="Arial"/>
-          <w:sz w:val="24"/>
-          <w:szCs w:val="24"/>
-        </w:rPr>
-        <w:t>----</w:t>
-      </w:r>
-      <w:r>
-        <w:rPr>
-          <w:rFonts w:cs="Arial"/>
-          <w:sz w:val="24"/>
-          <w:szCs w:val="24"/>
-        </w:rPr>
-        <w:t>-----</w:t>
-      </w:r>
-      <w:r>
-        <w:rPr>
-          <w:rFonts w:cs="Arial"/>
-          <w:b/>
-          <w:sz w:val="24"/>
-          <w:szCs w:val="24"/>
-        </w:rPr>
-        <w:t>PIHAK PERTAMA –</w:t>
-      </w:r>
-      <w:r>
-        <w:rPr>
-          <w:rFonts w:cs="Arial"/>
-          <w:b/>
-          <w:sz w:val="24"/>
-          <w:szCs w:val="24"/>
-        </w:rPr>
-        <w:t xml:space="preserve"> Y</w:t>
-      </w:r>
-      <w:r>
-        <w:rPr>
-          <w:rFonts w:cs="Arial"/>
-          <w:b/>
-          <w:sz w:val="24"/>
-          <w:szCs w:val="24"/>
-        </w:rPr>
-        <w:t>ANG MENYEWAKAN</w:t>
-      </w:r>
-      <w:r>
-        <w:rPr>
-          <w:rFonts w:cs="Arial"/>
-          <w:sz w:val="24"/>
-          <w:szCs w:val="24"/>
-        </w:rPr>
-        <w:t xml:space="preserve">  -------</w:t>
-      </w:r>
-      <w:r>
-        <w:rPr>
-          <w:rFonts w:cs="Arial"/>
-          <w:sz w:val="24"/>
-          <w:szCs w:val="24"/>
-          <w:lang w:val="en-US"/>
-        </w:rPr>
-        <w:t>-</w:t>
-      </w:r>
-      <w:r>
-        <w:rPr>
-          <w:rFonts w:cs="Arial"/>
-          <w:sz w:val="24"/>
-          <w:szCs w:val="24"/>
-        </w:rPr>
-        <w:t>-</w:t>
-      </w:r>
-      <w:r>
-        <w:rPr>
-          <w:rFonts w:cs="Arial"/>
-          <w:sz w:val="24"/>
-          <w:szCs w:val="24"/>
-          <w:lang w:val="en-US"/>
+        <w:t>-----------</w:t>
+      </w:r>
+      <w:r>
+        <w:rPr>
+          <w:rFonts w:cs="Arial"/>
+          <w:sz w:val="24"/>
+          <w:szCs w:val="24"/>
         </w:rPr>
         <w:t>--</w:t>
       </w:r>
@@ -2117,23 +2036,7 @@
           <w:sz w:val="24"/>
           <w:szCs w:val="24"/>
         </w:rPr>
-        <w:t>------------</w:t>
-      </w:r>
-      <w:r>
-        <w:rPr>
-          <w:rFonts w:cs="Arial"/>
-          <w:sz w:val="24"/>
-          <w:szCs w:val="24"/>
-        </w:rPr>
-        <w:t>--</w:t>
-      </w:r>
-      <w:r>
-        <w:rPr>
-          <w:rFonts w:cs="Arial"/>
-          <w:sz w:val="24"/>
-          <w:szCs w:val="24"/>
-        </w:rPr>
-        <w:t>-----</w:t>
+        <w:t>---</w:t>
       </w:r>
     </w:p>
     <w:p>
@@ -2736,6 +2639,14 @@
       <w:r>
         <w:rPr>
           <w:rFonts w:cs="Arial"/>
+          <w:sz w:val="24"/>
+          <w:szCs w:val="24"/>
+        </w:rPr>
+        <w:t>-------------------------------------------------------------</w:t>
+      </w:r>
+      <w:r>
+        <w:rPr>
+          <w:rFonts w:cs="Arial"/>
           <w:b/>
           <w:sz w:val="24"/>
           <w:szCs w:val="24"/>
@@ -2894,7 +2805,34 @@
           <w:sz w:val="24"/>
           <w:szCs w:val="24"/>
         </w:rPr>
-        <w:t>PIHAK KEDUA- PENYEWA</w:t>
+        <w:t>PIHAK KEDUA</w:t>
+      </w:r>
+      <w:r>
+        <w:rPr>
+          <w:rFonts w:cs="Arial"/>
+          <w:b/>
+          <w:sz w:val="24"/>
+          <w:szCs w:val="24"/>
+        </w:rPr>
+        <w:t xml:space="preserve"> </w:t>
+      </w:r>
+      <w:r>
+        <w:rPr>
+          <w:rFonts w:cs="Arial"/>
+          <w:b/>
+          <w:sz w:val="24"/>
+          <w:szCs w:val="24"/>
+        </w:rPr>
+        <w:t xml:space="preserve">– </w:t>
+      </w:r>
+      <w:r>
+        <w:rPr>
+          <w:rFonts w:cs="Arial"/>
+          <w:b/>
+          <w:sz w:val="24"/>
+          <w:szCs w:val="24"/>
+        </w:rPr>
+        <w:t>PENYEWA</w:t>
       </w:r>
       <w:r>
         <w:rPr>
@@ -2951,7 +2889,7 @@
           <w:sz w:val="24"/>
           <w:szCs w:val="24"/>
         </w:rPr>
-        <w:t>-----</w:t>
+        <w:t>---</w:t>
       </w:r>
     </w:p>
     <w:p>
@@ -4334,6 +4272,19 @@
           <w:rFonts w:cs="Arial"/>
           <w:sz w:val="24"/>
           <w:szCs w:val="24"/>
+          <w:lang w:val="en-US"/>
+        </w:rPr>
+      </w:pPr>
+    </w:p>
+    <w:p>
+      <w:pPr>
+        <w:spacing w:after="0" w:line="240" w:lineRule="auto"/>
+        <w:ind w:left="5760" w:firstLine="720"/>
+        <w:jc w:val="both"/>
+        <w:rPr>
+          <w:rFonts w:cs="Arial"/>
+          <w:sz w:val="24"/>
+          <w:szCs w:val="24"/>
         </w:rPr>
       </w:pPr>
       <w:r>
@@ -5240,6 +5191,15 @@
           <w:lang w:val="en-US"/>
         </w:rPr>
         <w:t>---------</w:t>
+      </w:r>
+      <w:r>
+        <w:rPr>
+          <w:rFonts w:cs="Arial"/>
+          <w:sz w:val="24"/>
+          <w:szCs w:val="24"/>
+          <w:lang w:val="en-US"/>
+        </w:rPr>
+        <w:t>----------------------------------------------------------------------------</w:t>
       </w:r>
       <w:r>
         <w:rPr>
@@ -14627,6 +14587,7 @@
   <w:style w:type="character" w:default="1" w:styleId="DefaultParagraphFont">
     <w:name w:val="Default Paragraph Font"/>
     <w:uiPriority w:val="1"/>
+    <w:semiHidden/>
     <w:unhideWhenUsed/>
   </w:style>
   <w:style w:type="table" w:default="1" w:styleId="TableNormal">

</xml_diff>